<commit_message>
Add QR payment contract documents
- Update software development contract for QR payment feature
- Add non-disclosure agreement (NDA) document

🤖 Generated with [Claude Code](https://claude.ai/code)

Co-Authored-By: Claude <noreply@anthropic.com>
</commit_message>
<xml_diff>
--- a/契約書/QRPayment/YSystem_SoftwareDevelopment_QRPaymentFeature.docx
+++ b/契約書/QRPayment/YSystem_SoftwareDevelopment_QRPaymentFeature.docx
@@ -518,7 +518,55 @@
           <w:sz w:val="24"/>
           <w14:ligatures w14:val="none"/>
         </w:rPr>
-        <w:t>[Delivery Date]</w:t>
+        <w:t>05</w:t>
+      </w:r>
+      <w:r>
+        <w:rPr>
+          <w:rFonts w:ascii="Arial" w:eastAsia="ＭＳ Ｐゴシック" w:hAnsi="Arial" w:cs="Arial"/>
+          <w:b/>
+          <w:bCs/>
+          <w:color w:val="EE0000"/>
+          <w:kern w:val="0"/>
+          <w:sz w:val="24"/>
+          <w14:ligatures w14:val="none"/>
+        </w:rPr>
+        <w:t xml:space="preserve"> </w:t>
+      </w:r>
+      <w:r>
+        <w:rPr>
+          <w:rFonts w:ascii="Arial" w:eastAsia="ＭＳ Ｐゴシック" w:hAnsi="Arial" w:cs="Arial"/>
+          <w:b/>
+          <w:bCs/>
+          <w:color w:val="EE0000"/>
+          <w:kern w:val="0"/>
+          <w:sz w:val="24"/>
+          <w14:ligatures w14:val="none"/>
+        </w:rPr>
+        <w:t>December</w:t>
+      </w:r>
+      <w:r>
+        <w:rPr>
+          <w:rFonts w:ascii="Arial" w:eastAsia="ＭＳ Ｐゴシック" w:hAnsi="Arial" w:cs="Arial"/>
+          <w:b/>
+          <w:bCs/>
+          <w:color w:val="EE0000"/>
+          <w:kern w:val="0"/>
+          <w:sz w:val="24"/>
+          <w14:ligatures w14:val="none"/>
+        </w:rPr>
+        <w:t xml:space="preserve"> </w:t>
+      </w:r>
+      <w:r>
+        <w:rPr>
+          <w:rFonts w:ascii="Arial" w:eastAsia="ＭＳ Ｐゴシック" w:hAnsi="Arial" w:cs="Arial"/>
+          <w:b/>
+          <w:bCs/>
+          <w:color w:val="EE0000"/>
+          <w:kern w:val="0"/>
+          <w:sz w:val="24"/>
+          <w14:ligatures w14:val="none"/>
+        </w:rPr>
+        <w:t>2025</w:t>
       </w:r>
       <w:r>
         <w:rPr>
@@ -915,31 +963,56 @@
       </w:pPr>
       <w:r>
         <w:rPr>
-          <w:rFonts w:ascii="Arial" w:eastAsia="ＭＳ Ｐゴシック" w:hAnsi="Arial" w:cs="Arial"/>
-          <w:kern w:val="0"/>
-          <w:sz w:val="24"/>
-          <w14:ligatures w14:val="none"/>
+          <w:rFonts w:ascii="Arial" w:hAnsi="Arial" w:cs="Arial"/>
         </w:rPr>
         <w:t xml:space="preserve">The Client shall pay the Developer for the services as per the development phases described in </w:t>
       </w:r>
       <w:r>
         <w:rPr>
-          <w:rFonts w:ascii="Arial" w:eastAsia="ＭＳ Ｐゴシック" w:hAnsi="Arial" w:cs="Arial"/>
+          <w:rFonts w:ascii="Arial" w:hAnsi="Arial" w:cs="Arial"/>
           <w:color w:val="EE0000"/>
-          <w:kern w:val="0"/>
-          <w:sz w:val="24"/>
-          <w14:ligatures w14:val="none"/>
         </w:rPr>
         <w:t>Exhibit B</w:t>
       </w:r>
       <w:r>
         <w:rPr>
-          <w:rFonts w:ascii="Arial" w:eastAsia="ＭＳ Ｐゴシック" w:hAnsi="Arial" w:cs="Arial"/>
-          <w:kern w:val="0"/>
-          <w:sz w:val="24"/>
-          <w14:ligatures w14:val="none"/>
+          <w:rFonts w:ascii="Arial" w:hAnsi="Arial" w:cs="Arial"/>
         </w:rPr>
         <w:t>. Payment amounts and timelines are detailed therein.</w:t>
+      </w:r>
+      <w:r>
+        <w:rPr>
+          <w:rFonts w:ascii="Arial" w:hAnsi="Arial" w:cs="Arial"/>
+        </w:rPr>
+        <w:br/>
+      </w:r>
+      <w:r>
+        <w:rPr>
+          <w:rStyle w:val="aa"/>
+          <w:rFonts w:ascii="Arial" w:hAnsi="Arial" w:cs="Arial"/>
+          <w:b w:val="0"/>
+          <w:bCs w:val="0"/>
+        </w:rPr>
+        <w:t xml:space="preserve">The dates listed in </w:t>
+      </w:r>
+      <w:r>
+        <w:rPr>
+          <w:rStyle w:val="aa"/>
+          <w:rFonts w:ascii="Arial" w:hAnsi="Arial" w:cs="Arial"/>
+          <w:b w:val="0"/>
+          <w:bCs w:val="0"/>
+          <w:color w:val="EE0000"/>
+        </w:rPr>
+        <w:t>Exhibit B</w:t>
+      </w:r>
+      <w:r>
+        <w:rPr>
+          <w:rStyle w:val="aa"/>
+          <w:rFonts w:ascii="Arial" w:hAnsi="Arial" w:cs="Arial"/>
+          <w:b w:val="0"/>
+          <w:bCs w:val="0"/>
+        </w:rPr>
+        <w:t xml:space="preserve"> for each development phase are for reference only. The Developer will provide advance notice (approximately two weeks prior) and inform the Client of the actual delivery dates based on the progress of development.</w:t>
       </w:r>
     </w:p>
     <w:p>
@@ -1086,7 +1159,17 @@
           <w:sz w:val="24"/>
           <w14:ligatures w14:val="none"/>
         </w:rPr>
-        <w:t>The Developer agrees to maintain strict confidentiality regarding all business and technical information (including specifications, source code, and business plans) obtained from the Client. No unauthorized use, disclosure, or duplication of confidential information is permitted.</w:t>
+        <w:t xml:space="preserve">The Developer agrees to maintain strict confidentiality regarding all business and technical information (including specifications, source code, and business </w:t>
+      </w:r>
+      <w:r>
+        <w:rPr>
+          <w:rFonts w:ascii="Arial" w:eastAsia="ＭＳ Ｐゴシック" w:hAnsi="Arial" w:cs="Arial"/>
+          <w:kern w:val="0"/>
+          <w:sz w:val="24"/>
+          <w14:ligatures w14:val="none"/>
+        </w:rPr>
+        <w:lastRenderedPageBreak/>
+        <w:t>plans) obtained from the Client. No unauthorized use, disclosure, or duplication of confidential information is permitted.</w:t>
       </w:r>
     </w:p>
     <w:p>
@@ -1114,7 +1197,6 @@
           <w:szCs w:val="27"/>
           <w14:ligatures w14:val="none"/>
         </w:rPr>
-        <w:lastRenderedPageBreak/>
         <w:t>7. Developer Warranties</w:t>
       </w:r>
     </w:p>
@@ -1391,16 +1473,33 @@
           <w:kern w:val="0"/>
           <w:sz w:val="24"/>
         </w:rPr>
-        <w:t xml:space="preserve">This Software Development Agreement and the interpretation of its terms shall be governed by and construed in accordance with the laws of the </w:t>
+        <w:t>This Software Development Agreement and the interpretation of its terms shall be governed by and construed in accordance with the laws of the</w:t>
       </w:r>
       <w:r>
         <w:rPr>
           <w:rFonts w:ascii="Arial" w:hAnsi="Arial" w:cs="Arial"/>
-          <w:color w:val="FF0000"/>
-          <w:kern w:val="0"/>
-          <w:sz w:val="24"/>
-        </w:rPr>
-        <w:t xml:space="preserve">State of Tokyo </w:t>
+          <w:color w:val="000000"/>
+          <w:kern w:val="0"/>
+          <w:sz w:val="24"/>
+        </w:rPr>
+        <w:t xml:space="preserve"> </w:t>
+      </w:r>
+      <w:r>
+        <w:rPr>
+          <w:rFonts w:ascii="Arial" w:hAnsi="Arial" w:cs="Arial"/>
+          <w:color w:val="EE0000"/>
+          <w:sz w:val="24"/>
+        </w:rPr>
+        <w:t>Japan (Tokyo)</w:t>
+      </w:r>
+      <w:r>
+        <w:rPr>
+          <w:rFonts w:ascii="Arial" w:hAnsi="Arial" w:cs="Arial"/>
+          <w:color w:val="EE0000"/>
+          <w:kern w:val="0"/>
+          <w:sz w:val="24"/>
+        </w:rPr>
+        <w:t xml:space="preserve"> </w:t>
       </w:r>
       <w:r>
         <w:rPr>
@@ -1735,7 +1834,7 @@
           </mc:Choice>
           <mc:Fallback>
             <w:pict>
-              <v:line w14:anchorId="78580750" id="直線コネクタ 3" o:spid="_x0000_s1026" style="position:absolute;z-index:251659264;visibility:visible;mso-wrap-style:square;mso-height-percent:0;mso-wrap-distance-left:9pt;mso-wrap-distance-top:0;mso-wrap-distance-right:9pt;mso-wrap-distance-bottom:0;mso-position-horizontal:absolute;mso-position-horizontal-relative:text;mso-position-vertical:absolute;mso-position-vertical-relative:text;mso-height-percent:0;mso-height-relative:margin" from="0,12.95pt" to="189pt,12.95pt" o:gfxdata="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" strokecolor="black [3213]" strokeweight=".25pt">
+              <v:line w14:anchorId="679FAC42" id="直線コネクタ 3" o:spid="_x0000_s1026" style="position:absolute;z-index:251659264;visibility:visible;mso-wrap-style:square;mso-height-percent:0;mso-wrap-distance-left:9pt;mso-wrap-distance-top:0;mso-wrap-distance-right:9pt;mso-wrap-distance-bottom:0;mso-position-horizontal:absolute;mso-position-horizontal-relative:text;mso-position-vertical:absolute;mso-position-vertical-relative:text;mso-height-percent:0;mso-height-relative:margin" from="0,12.95pt" to="189pt,12.95pt" o:gfxdata="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" strokecolor="black [3213]" strokeweight=".25pt">
                 <v:stroke joinstyle="miter"/>
               </v:line>
             </w:pict>
@@ -1950,7 +2049,7 @@
           </mc:Choice>
           <mc:Fallback>
             <w:pict>
-              <v:line w14:anchorId="48CECBDB" id="直線コネクタ 929965639" o:spid="_x0000_s1026" style="position:absolute;z-index:251661312;visibility:visible;mso-wrap-style:square;mso-height-percent:0;mso-wrap-distance-left:9pt;mso-wrap-distance-top:0;mso-wrap-distance-right:9pt;mso-wrap-distance-bottom:0;mso-position-horizontal:absolute;mso-position-horizontal-relative:text;mso-position-vertical:absolute;mso-position-vertical-relative:text;mso-height-percent:0;mso-height-relative:margin" from="-.05pt,10.75pt" to="188.95pt,10.75pt" o:gfxdata="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" strokecolor="black [3213]" strokeweight=".25pt">
+              <v:line w14:anchorId="05DAE9C4" id="直線コネクタ 929965639" o:spid="_x0000_s1026" style="position:absolute;z-index:251661312;visibility:visible;mso-wrap-style:square;mso-height-percent:0;mso-wrap-distance-left:9pt;mso-wrap-distance-top:0;mso-wrap-distance-right:9pt;mso-wrap-distance-bottom:0;mso-position-horizontal:absolute;mso-position-horizontal-relative:text;mso-position-vertical:absolute;mso-position-vertical-relative:text;mso-height-percent:0;mso-height-relative:margin" from="-.05pt,10.75pt" to="188.95pt,10.75pt" o:gfxdata="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" strokecolor="black [3213]" strokeweight=".25pt">
                 <v:stroke joinstyle="miter"/>
               </v:line>
             </w:pict>
@@ -2274,11 +2373,983 @@
         </w:rPr>
       </w:pPr>
     </w:p>
-    <w:p/>
-    <w:p>
-      <w:pPr>
+    <w:tbl>
+      <w:tblPr>
+        <w:tblW w:w="10360" w:type="dxa"/>
+        <w:tblInd w:w="-933" w:type="dxa"/>
+        <w:tblCellMar>
+          <w:left w:w="99" w:type="dxa"/>
+          <w:right w:w="99" w:type="dxa"/>
+        </w:tblCellMar>
+        <w:tblLook w:val="04A0" w:firstRow="1" w:lastRow="0" w:firstColumn="1" w:lastColumn="0" w:noHBand="0" w:noVBand="1"/>
+      </w:tblPr>
+      <w:tblGrid>
+        <w:gridCol w:w="1500"/>
+        <w:gridCol w:w="3720"/>
+        <w:gridCol w:w="5140"/>
+      </w:tblGrid>
+      <w:tr>
+        <w:trPr>
+          <w:trHeight w:val="400"/>
+        </w:trPr>
+        <w:tc>
+          <w:tcPr>
+            <w:tcW w:w="1500" w:type="dxa"/>
+            <w:tcBorders>
+              <w:top w:val="single" w:sz="4" w:space="0" w:color="auto"/>
+              <w:left w:val="single" w:sz="4" w:space="0" w:color="auto"/>
+              <w:bottom w:val="single" w:sz="4" w:space="0" w:color="auto"/>
+              <w:right w:val="single" w:sz="4" w:space="0" w:color="auto"/>
+            </w:tcBorders>
+            <w:shd w:val="clear" w:color="auto" w:fill="auto"/>
+            <w:noWrap/>
+            <w:vAlign w:val="center"/>
+            <w:hideMark/>
+          </w:tcPr>
+          <w:p>
+            <w:pPr>
+              <w:widowControl/>
+              <w:spacing w:after="0" w:line="240" w:lineRule="auto"/>
+              <w:jc w:val="center"/>
+              <w:rPr>
+                <w:rFonts w:ascii="Arial" w:eastAsia="Yu Gothic" w:hAnsi="Arial" w:cs="Arial"/>
+                <w:color w:val="000000"/>
+                <w:kern w:val="0"/>
+                <w:sz w:val="24"/>
+                <w14:ligatures w14:val="none"/>
+              </w:rPr>
+            </w:pPr>
+            <w:r>
+              <w:rPr>
+                <w:rFonts w:ascii="Arial" w:eastAsia="Yu Gothic" w:hAnsi="Arial" w:cs="Arial"/>
+                <w:color w:val="000000"/>
+                <w:kern w:val="0"/>
+                <w:sz w:val="24"/>
+                <w14:ligatures w14:val="none"/>
+              </w:rPr>
+              <w:t>Date</w:t>
+            </w:r>
+          </w:p>
+        </w:tc>
+        <w:tc>
+          <w:tcPr>
+            <w:tcW w:w="3720" w:type="dxa"/>
+            <w:tcBorders>
+              <w:top w:val="single" w:sz="4" w:space="0" w:color="auto"/>
+              <w:left w:val="nil"/>
+              <w:bottom w:val="single" w:sz="4" w:space="0" w:color="auto"/>
+              <w:right w:val="single" w:sz="4" w:space="0" w:color="auto"/>
+            </w:tcBorders>
+            <w:shd w:val="clear" w:color="auto" w:fill="auto"/>
+            <w:vAlign w:val="center"/>
+            <w:hideMark/>
+          </w:tcPr>
+          <w:p>
+            <w:pPr>
+              <w:widowControl/>
+              <w:spacing w:after="0" w:line="240" w:lineRule="auto"/>
+              <w:jc w:val="center"/>
+              <w:rPr>
+                <w:rFonts w:ascii="Arial" w:eastAsia="Yu Gothic" w:hAnsi="Arial" w:cs="Arial"/>
+                <w:color w:val="000000"/>
+                <w:kern w:val="0"/>
+                <w:sz w:val="24"/>
+                <w14:ligatures w14:val="none"/>
+              </w:rPr>
+            </w:pPr>
+            <w:r>
+              <w:rPr>
+                <w:rFonts w:ascii="Arial" w:eastAsia="Yu Gothic" w:hAnsi="Arial" w:cs="Arial"/>
+                <w:color w:val="000000"/>
+                <w:kern w:val="0"/>
+                <w:sz w:val="24"/>
+                <w14:ligatures w14:val="none"/>
+              </w:rPr>
+              <w:t>Milestone</w:t>
+            </w:r>
+          </w:p>
+        </w:tc>
+        <w:tc>
+          <w:tcPr>
+            <w:tcW w:w="5140" w:type="dxa"/>
+            <w:tcBorders>
+              <w:top w:val="single" w:sz="4" w:space="0" w:color="auto"/>
+              <w:left w:val="nil"/>
+              <w:bottom w:val="single" w:sz="4" w:space="0" w:color="auto"/>
+              <w:right w:val="single" w:sz="4" w:space="0" w:color="auto"/>
+            </w:tcBorders>
+            <w:shd w:val="clear" w:color="auto" w:fill="auto"/>
+            <w:vAlign w:val="center"/>
+            <w:hideMark/>
+          </w:tcPr>
+          <w:p>
+            <w:pPr>
+              <w:widowControl/>
+              <w:spacing w:after="0" w:line="240" w:lineRule="auto"/>
+              <w:jc w:val="center"/>
+              <w:rPr>
+                <w:rFonts w:ascii="Arial" w:eastAsia="Yu Gothic" w:hAnsi="Arial" w:cs="Arial"/>
+                <w:color w:val="000000"/>
+                <w:kern w:val="0"/>
+                <w:sz w:val="24"/>
+                <w14:ligatures w14:val="none"/>
+              </w:rPr>
+            </w:pPr>
+            <w:r>
+              <w:rPr>
+                <w:rFonts w:ascii="Arial" w:eastAsia="Yu Gothic" w:hAnsi="Arial" w:cs="Arial"/>
+                <w:color w:val="000000"/>
+                <w:kern w:val="0"/>
+                <w:sz w:val="24"/>
+                <w14:ligatures w14:val="none"/>
+              </w:rPr>
+              <w:t>Payment amount</w:t>
+            </w:r>
+          </w:p>
+        </w:tc>
+      </w:tr>
+      <w:tr>
+        <w:trPr>
+          <w:trHeight w:val="400"/>
+        </w:trPr>
+        <w:tc>
+          <w:tcPr>
+            <w:tcW w:w="1500" w:type="dxa"/>
+            <w:tcBorders>
+              <w:top w:val="nil"/>
+              <w:left w:val="single" w:sz="4" w:space="0" w:color="auto"/>
+              <w:bottom w:val="single" w:sz="4" w:space="0" w:color="auto"/>
+              <w:right w:val="single" w:sz="4" w:space="0" w:color="auto"/>
+            </w:tcBorders>
+            <w:shd w:val="clear" w:color="auto" w:fill="auto"/>
+            <w:vAlign w:val="center"/>
+            <w:hideMark/>
+          </w:tcPr>
+          <w:p>
+            <w:pPr>
+              <w:widowControl/>
+              <w:spacing w:after="0" w:line="240" w:lineRule="auto"/>
+              <w:jc w:val="center"/>
+              <w:rPr>
+                <w:rFonts w:ascii="Arial" w:eastAsia="Yu Gothic" w:hAnsi="Arial" w:cs="Arial"/>
+                <w:color w:val="000000"/>
+                <w:kern w:val="0"/>
+                <w:sz w:val="24"/>
+                <w14:ligatures w14:val="none"/>
+              </w:rPr>
+            </w:pPr>
+            <w:r>
+              <w:rPr>
+                <w:rFonts w:ascii="Arial" w:eastAsia="Yu Gothic" w:hAnsi="Arial" w:cs="Arial"/>
+                <w:color w:val="000000"/>
+                <w:kern w:val="0"/>
+                <w:sz w:val="24"/>
+                <w14:ligatures w14:val="none"/>
+              </w:rPr>
+              <w:t>21-Jul-25</w:t>
+            </w:r>
+          </w:p>
+        </w:tc>
+        <w:tc>
+          <w:tcPr>
+            <w:tcW w:w="3720" w:type="dxa"/>
+            <w:tcBorders>
+              <w:top w:val="nil"/>
+              <w:left w:val="nil"/>
+              <w:bottom w:val="single" w:sz="4" w:space="0" w:color="auto"/>
+              <w:right w:val="single" w:sz="4" w:space="0" w:color="auto"/>
+            </w:tcBorders>
+            <w:shd w:val="clear" w:color="auto" w:fill="auto"/>
+            <w:noWrap/>
+            <w:vAlign w:val="center"/>
+            <w:hideMark/>
+          </w:tcPr>
+          <w:p>
+            <w:pPr>
+              <w:widowControl/>
+              <w:spacing w:after="0" w:line="240" w:lineRule="auto"/>
+              <w:jc w:val="center"/>
+              <w:rPr>
+                <w:rFonts w:ascii="Arial" w:eastAsia="Yu Gothic" w:hAnsi="Arial" w:cs="Arial"/>
+                <w:color w:val="000000"/>
+                <w:kern w:val="0"/>
+                <w:sz w:val="24"/>
+                <w14:ligatures w14:val="none"/>
+              </w:rPr>
+            </w:pPr>
+            <w:r>
+              <w:rPr>
+                <w:rFonts w:ascii="Arial" w:eastAsia="Yu Gothic" w:hAnsi="Arial" w:cs="Arial"/>
+                <w:color w:val="000000"/>
+                <w:kern w:val="0"/>
+                <w:sz w:val="24"/>
+                <w14:ligatures w14:val="none"/>
+              </w:rPr>
+              <w:t>Contract</w:t>
+            </w:r>
+          </w:p>
+        </w:tc>
+        <w:tc>
+          <w:tcPr>
+            <w:tcW w:w="5140" w:type="dxa"/>
+            <w:tcBorders>
+              <w:top w:val="nil"/>
+              <w:left w:val="nil"/>
+              <w:bottom w:val="single" w:sz="4" w:space="0" w:color="auto"/>
+              <w:right w:val="single" w:sz="4" w:space="0" w:color="auto"/>
+            </w:tcBorders>
+            <w:shd w:val="clear" w:color="auto" w:fill="auto"/>
+            <w:noWrap/>
+            <w:vAlign w:val="center"/>
+            <w:hideMark/>
+          </w:tcPr>
+          <w:p>
+            <w:pPr>
+              <w:widowControl/>
+              <w:spacing w:after="0" w:line="240" w:lineRule="auto"/>
+              <w:jc w:val="center"/>
+              <w:rPr>
+                <w:rFonts w:ascii="Arial" w:eastAsia="Yu Gothic" w:hAnsi="Arial" w:cs="Arial"/>
+                <w:color w:val="000000"/>
+                <w:kern w:val="0"/>
+                <w:sz w:val="24"/>
+                <w14:ligatures w14:val="none"/>
+              </w:rPr>
+            </w:pPr>
+            <w:r>
+              <w:rPr>
+                <w:rFonts w:ascii="Arial" w:eastAsia="Yu Gothic" w:hAnsi="Arial" w:cs="Arial"/>
+                <w:color w:val="000000"/>
+                <w:kern w:val="0"/>
+                <w:sz w:val="24"/>
+                <w14:ligatures w14:val="none"/>
+              </w:rPr>
+              <w:t xml:space="preserve">JPY </w:t>
+            </w:r>
+            <w:r>
+              <w:rPr>
+                <w:rFonts w:ascii="Arial" w:eastAsia="Yu Gothic" w:hAnsi="Arial" w:cs="Arial"/>
+                <w:color w:val="000000"/>
+                <w:kern w:val="0"/>
+                <w:sz w:val="24"/>
+                <w14:ligatures w14:val="none"/>
+              </w:rPr>
+              <w:t>5,760,00</w:t>
+            </w:r>
+            <w:r>
+              <w:rPr>
+                <w:rFonts w:ascii="Arial" w:eastAsia="Yu Gothic" w:hAnsi="Arial" w:cs="Arial"/>
+                <w:color w:val="000000"/>
+                <w:kern w:val="0"/>
+                <w:sz w:val="24"/>
+                <w14:ligatures w14:val="none"/>
+              </w:rPr>
+              <w:t>0</w:t>
+            </w:r>
+          </w:p>
+        </w:tc>
+      </w:tr>
+      <w:tr>
+        <w:trPr>
+          <w:trHeight w:val="400"/>
+        </w:trPr>
+        <w:tc>
+          <w:tcPr>
+            <w:tcW w:w="1500" w:type="dxa"/>
+            <w:tcBorders>
+              <w:top w:val="nil"/>
+              <w:left w:val="single" w:sz="4" w:space="0" w:color="auto"/>
+              <w:bottom w:val="single" w:sz="4" w:space="0" w:color="auto"/>
+              <w:right w:val="single" w:sz="4" w:space="0" w:color="auto"/>
+            </w:tcBorders>
+            <w:shd w:val="clear" w:color="auto" w:fill="auto"/>
+            <w:vAlign w:val="center"/>
+            <w:hideMark/>
+          </w:tcPr>
+          <w:p>
+            <w:pPr>
+              <w:widowControl/>
+              <w:spacing w:after="0" w:line="240" w:lineRule="auto"/>
+              <w:jc w:val="center"/>
+              <w:rPr>
+                <w:rFonts w:ascii="Arial" w:eastAsia="Yu Gothic" w:hAnsi="Arial" w:cs="Arial"/>
+                <w:color w:val="000000"/>
+                <w:kern w:val="0"/>
+                <w:sz w:val="24"/>
+                <w14:ligatures w14:val="none"/>
+              </w:rPr>
+            </w:pPr>
+            <w:r>
+              <w:rPr>
+                <w:rFonts w:ascii="Arial" w:eastAsia="Yu Gothic" w:hAnsi="Arial" w:cs="Arial"/>
+                <w:color w:val="000000"/>
+                <w:kern w:val="0"/>
+                <w:sz w:val="24"/>
+                <w14:ligatures w14:val="none"/>
+              </w:rPr>
+              <w:t>15-Sep-25</w:t>
+            </w:r>
+          </w:p>
+        </w:tc>
+        <w:tc>
+          <w:tcPr>
+            <w:tcW w:w="3720" w:type="dxa"/>
+            <w:tcBorders>
+              <w:top w:val="nil"/>
+              <w:left w:val="nil"/>
+              <w:bottom w:val="single" w:sz="4" w:space="0" w:color="auto"/>
+              <w:right w:val="single" w:sz="4" w:space="0" w:color="auto"/>
+            </w:tcBorders>
+            <w:shd w:val="clear" w:color="auto" w:fill="auto"/>
+            <w:noWrap/>
+            <w:vAlign w:val="center"/>
+            <w:hideMark/>
+          </w:tcPr>
+          <w:p>
+            <w:pPr>
+              <w:widowControl/>
+              <w:spacing w:after="0" w:line="240" w:lineRule="auto"/>
+              <w:jc w:val="center"/>
+              <w:rPr>
+                <w:rFonts w:ascii="Arial" w:eastAsia="Yu Gothic" w:hAnsi="Arial" w:cs="Arial"/>
+                <w:color w:val="000000"/>
+                <w:kern w:val="0"/>
+                <w:sz w:val="24"/>
+                <w14:ligatures w14:val="none"/>
+              </w:rPr>
+            </w:pPr>
+            <w:r>
+              <w:rPr>
+                <w:rFonts w:ascii="Arial" w:eastAsia="Yu Gothic" w:hAnsi="Arial" w:cs="Arial"/>
+                <w:color w:val="000000"/>
+                <w:kern w:val="0"/>
+                <w:sz w:val="24"/>
+                <w14:ligatures w14:val="none"/>
+              </w:rPr>
+              <w:t>(a) (b) Launch the beta version</w:t>
+            </w:r>
+          </w:p>
+        </w:tc>
+        <w:tc>
+          <w:tcPr>
+            <w:tcW w:w="5140" w:type="dxa"/>
+            <w:tcBorders>
+              <w:top w:val="nil"/>
+              <w:left w:val="nil"/>
+              <w:bottom w:val="single" w:sz="4" w:space="0" w:color="auto"/>
+              <w:right w:val="single" w:sz="4" w:space="0" w:color="auto"/>
+            </w:tcBorders>
+            <w:shd w:val="clear" w:color="auto" w:fill="auto"/>
+            <w:noWrap/>
+            <w:vAlign w:val="center"/>
+            <w:hideMark/>
+          </w:tcPr>
+          <w:p>
+            <w:pPr>
+              <w:widowControl/>
+              <w:spacing w:after="0" w:line="240" w:lineRule="auto"/>
+              <w:jc w:val="center"/>
+              <w:rPr>
+                <w:rFonts w:ascii="Arial" w:eastAsia="Yu Gothic" w:hAnsi="Arial" w:cs="Arial"/>
+                <w:color w:val="000000"/>
+                <w:kern w:val="0"/>
+                <w:sz w:val="24"/>
+                <w14:ligatures w14:val="none"/>
+              </w:rPr>
+            </w:pPr>
+            <w:r>
+              <w:rPr>
+                <w:rFonts w:ascii="Arial" w:eastAsia="Yu Gothic" w:hAnsi="Arial" w:cs="Arial"/>
+                <w:color w:val="000000"/>
+                <w:kern w:val="0"/>
+                <w:sz w:val="24"/>
+                <w14:ligatures w14:val="none"/>
+              </w:rPr>
+              <w:t xml:space="preserve">JPY </w:t>
+            </w:r>
+            <w:r>
+              <w:rPr>
+                <w:rFonts w:ascii="Arial" w:eastAsia="Yu Gothic" w:hAnsi="Arial" w:cs="Arial"/>
+                <w:color w:val="000000"/>
+                <w:kern w:val="0"/>
+                <w:sz w:val="24"/>
+                <w14:ligatures w14:val="none"/>
+              </w:rPr>
+              <w:t>5,760,00</w:t>
+            </w:r>
+            <w:r>
+              <w:rPr>
+                <w:rFonts w:ascii="Arial" w:eastAsia="Yu Gothic" w:hAnsi="Arial" w:cs="Arial"/>
+                <w:color w:val="000000"/>
+                <w:kern w:val="0"/>
+                <w:sz w:val="24"/>
+                <w14:ligatures w14:val="none"/>
+              </w:rPr>
+              <w:t>0</w:t>
+            </w:r>
+          </w:p>
+        </w:tc>
+      </w:tr>
+      <w:tr>
+        <w:trPr>
+          <w:trHeight w:val="400"/>
+        </w:trPr>
+        <w:tc>
+          <w:tcPr>
+            <w:tcW w:w="1500" w:type="dxa"/>
+            <w:tcBorders>
+              <w:top w:val="nil"/>
+              <w:left w:val="single" w:sz="4" w:space="0" w:color="auto"/>
+              <w:bottom w:val="single" w:sz="4" w:space="0" w:color="auto"/>
+              <w:right w:val="single" w:sz="4" w:space="0" w:color="auto"/>
+            </w:tcBorders>
+            <w:shd w:val="clear" w:color="auto" w:fill="auto"/>
+            <w:vAlign w:val="center"/>
+            <w:hideMark/>
+          </w:tcPr>
+          <w:p>
+            <w:pPr>
+              <w:widowControl/>
+              <w:spacing w:after="0" w:line="240" w:lineRule="auto"/>
+              <w:jc w:val="center"/>
+              <w:rPr>
+                <w:rFonts w:ascii="Arial" w:eastAsia="Yu Gothic" w:hAnsi="Arial" w:cs="Arial"/>
+                <w:color w:val="000000"/>
+                <w:kern w:val="0"/>
+                <w:sz w:val="24"/>
+                <w14:ligatures w14:val="none"/>
+              </w:rPr>
+            </w:pPr>
+            <w:r>
+              <w:rPr>
+                <w:rFonts w:ascii="Arial" w:eastAsia="Yu Gothic" w:hAnsi="Arial" w:cs="Arial"/>
+                <w:color w:val="000000"/>
+                <w:kern w:val="0"/>
+                <w:sz w:val="24"/>
+                <w14:ligatures w14:val="none"/>
+              </w:rPr>
+              <w:t>15-Oct-25</w:t>
+            </w:r>
+          </w:p>
+        </w:tc>
+        <w:tc>
+          <w:tcPr>
+            <w:tcW w:w="3720" w:type="dxa"/>
+            <w:tcBorders>
+              <w:top w:val="nil"/>
+              <w:left w:val="nil"/>
+              <w:bottom w:val="single" w:sz="4" w:space="0" w:color="auto"/>
+              <w:right w:val="single" w:sz="4" w:space="0" w:color="auto"/>
+            </w:tcBorders>
+            <w:shd w:val="clear" w:color="auto" w:fill="auto"/>
+            <w:noWrap/>
+            <w:vAlign w:val="center"/>
+            <w:hideMark/>
+          </w:tcPr>
+          <w:p>
+            <w:pPr>
+              <w:widowControl/>
+              <w:spacing w:after="0" w:line="240" w:lineRule="auto"/>
+              <w:jc w:val="center"/>
+              <w:rPr>
+                <w:rFonts w:ascii="Arial" w:eastAsia="Yu Gothic" w:hAnsi="Arial" w:cs="Arial"/>
+                <w:color w:val="000000"/>
+                <w:kern w:val="0"/>
+                <w:sz w:val="24"/>
+                <w14:ligatures w14:val="none"/>
+              </w:rPr>
+            </w:pPr>
+            <w:r>
+              <w:rPr>
+                <w:rFonts w:ascii="Arial" w:eastAsia="Yu Gothic" w:hAnsi="Arial" w:cs="Arial"/>
+                <w:color w:val="000000"/>
+                <w:kern w:val="0"/>
+                <w:sz w:val="24"/>
+                <w14:ligatures w14:val="none"/>
+              </w:rPr>
+              <w:t>(c) (d) Launch the beta version</w:t>
+            </w:r>
+          </w:p>
+        </w:tc>
+        <w:tc>
+          <w:tcPr>
+            <w:tcW w:w="5140" w:type="dxa"/>
+            <w:tcBorders>
+              <w:top w:val="nil"/>
+              <w:left w:val="nil"/>
+              <w:bottom w:val="single" w:sz="4" w:space="0" w:color="auto"/>
+              <w:right w:val="single" w:sz="4" w:space="0" w:color="auto"/>
+            </w:tcBorders>
+            <w:shd w:val="clear" w:color="auto" w:fill="auto"/>
+            <w:noWrap/>
+            <w:vAlign w:val="center"/>
+            <w:hideMark/>
+          </w:tcPr>
+          <w:p>
+            <w:pPr>
+              <w:widowControl/>
+              <w:spacing w:after="0" w:line="240" w:lineRule="auto"/>
+              <w:jc w:val="center"/>
+              <w:rPr>
+                <w:rFonts w:ascii="Arial" w:eastAsia="Yu Gothic" w:hAnsi="Arial" w:cs="Arial"/>
+                <w:color w:val="000000"/>
+                <w:kern w:val="0"/>
+                <w:sz w:val="24"/>
+                <w14:ligatures w14:val="none"/>
+              </w:rPr>
+            </w:pPr>
+            <w:r>
+              <w:rPr>
+                <w:rFonts w:ascii="Arial" w:eastAsia="Yu Gothic" w:hAnsi="Arial" w:cs="Arial"/>
+                <w:color w:val="000000"/>
+                <w:kern w:val="0"/>
+                <w:sz w:val="24"/>
+                <w14:ligatures w14:val="none"/>
+              </w:rPr>
+              <w:t xml:space="preserve">JPY </w:t>
+            </w:r>
+            <w:r>
+              <w:rPr>
+                <w:rFonts w:ascii="Arial" w:eastAsia="Yu Gothic" w:hAnsi="Arial" w:cs="Arial"/>
+                <w:color w:val="000000"/>
+                <w:kern w:val="0"/>
+                <w:sz w:val="24"/>
+                <w14:ligatures w14:val="none"/>
+              </w:rPr>
+              <w:t>5,760,000</w:t>
+            </w:r>
+          </w:p>
+        </w:tc>
+      </w:tr>
+      <w:tr>
+        <w:trPr>
+          <w:trHeight w:val="400"/>
+        </w:trPr>
+        <w:tc>
+          <w:tcPr>
+            <w:tcW w:w="1500" w:type="dxa"/>
+            <w:tcBorders>
+              <w:top w:val="nil"/>
+              <w:left w:val="single" w:sz="4" w:space="0" w:color="auto"/>
+              <w:bottom w:val="single" w:sz="4" w:space="0" w:color="auto"/>
+              <w:right w:val="single" w:sz="4" w:space="0" w:color="auto"/>
+            </w:tcBorders>
+            <w:shd w:val="clear" w:color="auto" w:fill="auto"/>
+            <w:vAlign w:val="center"/>
+            <w:hideMark/>
+          </w:tcPr>
+          <w:p>
+            <w:pPr>
+              <w:widowControl/>
+              <w:spacing w:after="0" w:line="240" w:lineRule="auto"/>
+              <w:jc w:val="center"/>
+              <w:rPr>
+                <w:rFonts w:ascii="Arial" w:eastAsia="Yu Gothic" w:hAnsi="Arial" w:cs="Arial"/>
+                <w:color w:val="000000"/>
+                <w:kern w:val="0"/>
+                <w:sz w:val="24"/>
+                <w14:ligatures w14:val="none"/>
+              </w:rPr>
+            </w:pPr>
+            <w:r>
+              <w:rPr>
+                <w:rFonts w:ascii="Arial" w:eastAsia="Yu Gothic" w:hAnsi="Arial" w:cs="Arial"/>
+                <w:color w:val="000000"/>
+                <w:kern w:val="0"/>
+                <w:sz w:val="24"/>
+                <w14:ligatures w14:val="none"/>
+              </w:rPr>
+              <w:t>17-Nov-25</w:t>
+            </w:r>
+          </w:p>
+        </w:tc>
+        <w:tc>
+          <w:tcPr>
+            <w:tcW w:w="3720" w:type="dxa"/>
+            <w:tcBorders>
+              <w:top w:val="nil"/>
+              <w:left w:val="nil"/>
+              <w:bottom w:val="single" w:sz="4" w:space="0" w:color="auto"/>
+              <w:right w:val="single" w:sz="4" w:space="0" w:color="auto"/>
+            </w:tcBorders>
+            <w:shd w:val="clear" w:color="auto" w:fill="auto"/>
+            <w:noWrap/>
+            <w:vAlign w:val="center"/>
+            <w:hideMark/>
+          </w:tcPr>
+          <w:p>
+            <w:pPr>
+              <w:widowControl/>
+              <w:spacing w:after="0" w:line="240" w:lineRule="auto"/>
+              <w:jc w:val="center"/>
+              <w:rPr>
+                <w:rFonts w:ascii="Arial" w:eastAsia="Yu Gothic" w:hAnsi="Arial" w:cs="Arial"/>
+                <w:color w:val="000000"/>
+                <w:kern w:val="0"/>
+                <w:sz w:val="24"/>
+                <w14:ligatures w14:val="none"/>
+              </w:rPr>
+            </w:pPr>
+            <w:r>
+              <w:rPr>
+                <w:rFonts w:ascii="Arial" w:eastAsia="Yu Gothic" w:hAnsi="Arial" w:cs="Arial"/>
+                <w:color w:val="000000"/>
+                <w:kern w:val="0"/>
+                <w:sz w:val="24"/>
+                <w14:ligatures w14:val="none"/>
+              </w:rPr>
+              <w:t>(a) (b) (c) (d) Official release</w:t>
+            </w:r>
+          </w:p>
+        </w:tc>
+        <w:tc>
+          <w:tcPr>
+            <w:tcW w:w="5140" w:type="dxa"/>
+            <w:tcBorders>
+              <w:top w:val="nil"/>
+              <w:left w:val="nil"/>
+              <w:bottom w:val="single" w:sz="4" w:space="0" w:color="auto"/>
+              <w:right w:val="single" w:sz="4" w:space="0" w:color="auto"/>
+            </w:tcBorders>
+            <w:shd w:val="clear" w:color="auto" w:fill="auto"/>
+            <w:noWrap/>
+            <w:vAlign w:val="center"/>
+            <w:hideMark/>
+          </w:tcPr>
+          <w:p>
+            <w:pPr>
+              <w:widowControl/>
+              <w:spacing w:after="0" w:line="240" w:lineRule="auto"/>
+              <w:jc w:val="center"/>
+              <w:rPr>
+                <w:rFonts w:ascii="Arial" w:eastAsia="Yu Gothic" w:hAnsi="Arial" w:cs="Arial"/>
+                <w:color w:val="000000"/>
+                <w:kern w:val="0"/>
+                <w:sz w:val="24"/>
+                <w14:ligatures w14:val="none"/>
+              </w:rPr>
+            </w:pPr>
+            <w:r>
+              <w:rPr>
+                <w:rFonts w:ascii="Arial" w:eastAsia="Yu Gothic" w:hAnsi="Arial" w:cs="Arial"/>
+                <w:color w:val="000000"/>
+                <w:kern w:val="0"/>
+                <w:sz w:val="24"/>
+                <w14:ligatures w14:val="none"/>
+              </w:rPr>
+              <w:t xml:space="preserve">JPY </w:t>
+            </w:r>
+            <w:r>
+              <w:rPr>
+                <w:rFonts w:ascii="Arial" w:eastAsia="Yu Gothic" w:hAnsi="Arial" w:cs="Arial"/>
+                <w:color w:val="000000"/>
+                <w:kern w:val="0"/>
+                <w:sz w:val="24"/>
+                <w14:ligatures w14:val="none"/>
+              </w:rPr>
+              <w:t>5,760,000</w:t>
+            </w:r>
+          </w:p>
+        </w:tc>
+      </w:tr>
+      <w:tr>
+        <w:trPr>
+          <w:trHeight w:val="400"/>
+        </w:trPr>
+        <w:tc>
+          <w:tcPr>
+            <w:tcW w:w="1500" w:type="dxa"/>
+            <w:tcBorders>
+              <w:top w:val="nil"/>
+              <w:left w:val="single" w:sz="4" w:space="0" w:color="auto"/>
+              <w:bottom w:val="single" w:sz="4" w:space="0" w:color="auto"/>
+              <w:right w:val="single" w:sz="4" w:space="0" w:color="auto"/>
+            </w:tcBorders>
+            <w:shd w:val="clear" w:color="auto" w:fill="auto"/>
+            <w:vAlign w:val="center"/>
+            <w:hideMark/>
+          </w:tcPr>
+          <w:p>
+            <w:pPr>
+              <w:widowControl/>
+              <w:spacing w:after="0" w:line="240" w:lineRule="auto"/>
+              <w:jc w:val="center"/>
+              <w:rPr>
+                <w:rFonts w:ascii="Arial" w:eastAsia="Yu Gothic" w:hAnsi="Arial" w:cs="Arial"/>
+                <w:color w:val="000000"/>
+                <w:kern w:val="0"/>
+                <w:sz w:val="24"/>
+                <w14:ligatures w14:val="none"/>
+              </w:rPr>
+            </w:pPr>
+            <w:r>
+              <w:rPr>
+                <w:rFonts w:ascii="Arial" w:eastAsia="Yu Gothic" w:hAnsi="Arial" w:cs="Arial"/>
+                <w:color w:val="000000"/>
+                <w:kern w:val="0"/>
+                <w:sz w:val="24"/>
+                <w14:ligatures w14:val="none"/>
+              </w:rPr>
+              <w:t>1-Dec-25</w:t>
+            </w:r>
+          </w:p>
+        </w:tc>
+        <w:tc>
+          <w:tcPr>
+            <w:tcW w:w="3720" w:type="dxa"/>
+            <w:tcBorders>
+              <w:top w:val="nil"/>
+              <w:left w:val="nil"/>
+              <w:bottom w:val="single" w:sz="4" w:space="0" w:color="auto"/>
+              <w:right w:val="single" w:sz="4" w:space="0" w:color="auto"/>
+            </w:tcBorders>
+            <w:shd w:val="clear" w:color="auto" w:fill="auto"/>
+            <w:noWrap/>
+            <w:vAlign w:val="center"/>
+            <w:hideMark/>
+          </w:tcPr>
+          <w:p>
+            <w:pPr>
+              <w:widowControl/>
+              <w:spacing w:after="0" w:line="240" w:lineRule="auto"/>
+              <w:jc w:val="center"/>
+              <w:rPr>
+                <w:rFonts w:ascii="Arial" w:eastAsia="Yu Gothic" w:hAnsi="Arial" w:cs="Arial"/>
+                <w:color w:val="000000"/>
+                <w:kern w:val="0"/>
+                <w:sz w:val="24"/>
+                <w14:ligatures w14:val="none"/>
+              </w:rPr>
+            </w:pPr>
+            <w:r>
+              <w:rPr>
+                <w:rFonts w:ascii="Arial" w:eastAsia="Yu Gothic" w:hAnsi="Arial" w:cs="Arial"/>
+                <w:color w:val="000000"/>
+                <w:kern w:val="0"/>
+                <w:sz w:val="24"/>
+                <w14:ligatures w14:val="none"/>
+              </w:rPr>
+              <w:t>(e)Official release</w:t>
+            </w:r>
+          </w:p>
+        </w:tc>
+        <w:tc>
+          <w:tcPr>
+            <w:tcW w:w="5140" w:type="dxa"/>
+            <w:tcBorders>
+              <w:top w:val="nil"/>
+              <w:left w:val="nil"/>
+              <w:bottom w:val="single" w:sz="4" w:space="0" w:color="auto"/>
+              <w:right w:val="single" w:sz="4" w:space="0" w:color="auto"/>
+            </w:tcBorders>
+            <w:shd w:val="clear" w:color="auto" w:fill="auto"/>
+            <w:noWrap/>
+            <w:vAlign w:val="center"/>
+            <w:hideMark/>
+          </w:tcPr>
+          <w:p>
+            <w:pPr>
+              <w:widowControl/>
+              <w:spacing w:after="0" w:line="240" w:lineRule="auto"/>
+              <w:jc w:val="center"/>
+              <w:rPr>
+                <w:rFonts w:ascii="Arial" w:eastAsia="Yu Gothic" w:hAnsi="Arial" w:cs="Arial"/>
+                <w:color w:val="000000"/>
+                <w:kern w:val="0"/>
+                <w:sz w:val="24"/>
+                <w14:ligatures w14:val="none"/>
+              </w:rPr>
+            </w:pPr>
+            <w:r>
+              <w:rPr>
+                <w:rFonts w:ascii="Arial" w:eastAsia="Yu Gothic" w:hAnsi="Arial" w:cs="Arial"/>
+                <w:color w:val="000000"/>
+                <w:kern w:val="0"/>
+                <w:sz w:val="24"/>
+                <w14:ligatures w14:val="none"/>
+              </w:rPr>
+              <w:t xml:space="preserve">JPY </w:t>
+            </w:r>
+            <w:r>
+              <w:rPr>
+                <w:rFonts w:ascii="Arial" w:eastAsia="Yu Gothic" w:hAnsi="Arial" w:cs="Arial"/>
+                <w:color w:val="000000"/>
+                <w:kern w:val="0"/>
+                <w:sz w:val="24"/>
+                <w14:ligatures w14:val="none"/>
+              </w:rPr>
+              <w:t>5,760,000</w:t>
+            </w:r>
+          </w:p>
+        </w:tc>
+      </w:tr>
+    </w:tbl>
+    <w:p>
+      <w:pPr>
+        <w:widowControl/>
+        <w:spacing w:beforeAutospacing="1" w:after="0" w:afterAutospacing="1" w:line="240" w:lineRule="auto"/>
+        <w:rPr>
+          <w:rFonts w:ascii="Arial" w:eastAsia="ＭＳ Ｐゴシック" w:hAnsi="Arial" w:cs="Arial"/>
+          <w:kern w:val="0"/>
+          <w:sz w:val="24"/>
+          <w14:ligatures w14:val="none"/>
+        </w:rPr>
+      </w:pPr>
+    </w:p>
+    <w:p>
+      <w:pPr>
+        <w:widowControl/>
+        <w:spacing w:before="100" w:beforeAutospacing="1" w:after="100" w:afterAutospacing="1" w:line="240" w:lineRule="auto"/>
+        <w:outlineLvl w:val="2"/>
+        <w:rPr>
+          <w:rFonts w:ascii="Arial" w:eastAsia="ＭＳ Ｐゴシック" w:hAnsi="Arial" w:cs="Arial"/>
+          <w:b/>
+          <w:bCs/>
+          <w:kern w:val="0"/>
+          <w:sz w:val="27"/>
+          <w:szCs w:val="27"/>
+          <w14:ligatures w14:val="none"/>
+        </w:rPr>
+      </w:pPr>
+      <w:r>
+        <w:rPr>
+          <w:rFonts w:ascii="Arial" w:eastAsia="ＭＳ Ｐゴシック" w:hAnsi="Arial" w:cs="Arial"/>
+          <w:b/>
+          <w:bCs/>
+          <w:kern w:val="0"/>
+          <w:sz w:val="27"/>
+          <w:szCs w:val="27"/>
+          <w14:ligatures w14:val="none"/>
+        </w:rPr>
+        <w:t>Function Categories</w:t>
+      </w:r>
+    </w:p>
+    <w:p>
+      <w:pPr>
+        <w:widowControl/>
+        <w:spacing w:before="100" w:beforeAutospacing="1" w:after="100" w:afterAutospacing="1" w:line="240" w:lineRule="auto"/>
+        <w:ind w:left="360"/>
+        <w:rPr>
+          <w:rFonts w:ascii="Arial" w:eastAsia="ＭＳ Ｐゴシック" w:hAnsi="Arial" w:cs="Arial"/>
+          <w:b/>
+          <w:bCs/>
+          <w:kern w:val="0"/>
+          <w:sz w:val="24"/>
+          <w14:ligatures w14:val="none"/>
+        </w:rPr>
+      </w:pPr>
+      <w:r>
+        <w:rPr>
+          <w:rFonts w:ascii="Arial" w:eastAsia="ＭＳ Ｐゴシック" w:hAnsi="Arial" w:cs="Arial"/>
+          <w:b/>
+          <w:bCs/>
+          <w:kern w:val="0"/>
+          <w:sz w:val="24"/>
+          <w14:ligatures w14:val="none"/>
+        </w:rPr>
+        <w:t>(a) Static QR Transactions</w:t>
+      </w:r>
+    </w:p>
+    <w:p>
+      <w:pPr>
+        <w:widowControl/>
+        <w:spacing w:before="100" w:beforeAutospacing="1" w:after="100" w:afterAutospacing="1" w:line="240" w:lineRule="auto"/>
+        <w:ind w:left="360"/>
+        <w:rPr>
+          <w:rFonts w:ascii="Arial" w:eastAsia="ＭＳ Ｐゴシック" w:hAnsi="Arial" w:cs="Arial"/>
+          <w:b/>
+          <w:bCs/>
+          <w:kern w:val="0"/>
+          <w:sz w:val="24"/>
+          <w14:ligatures w14:val="none"/>
+        </w:rPr>
+      </w:pPr>
+      <w:r>
+        <w:rPr>
+          <w:rFonts w:ascii="Arial" w:eastAsia="ＭＳ Ｐゴシック" w:hAnsi="Arial" w:cs="Arial"/>
+          <w:b/>
+          <w:bCs/>
+          <w:kern w:val="0"/>
+          <w:sz w:val="24"/>
+          <w14:ligatures w14:val="none"/>
+        </w:rPr>
+        <w:t>(b) Wallet (App)</w:t>
+      </w:r>
+    </w:p>
+    <w:p>
+      <w:pPr>
+        <w:widowControl/>
+        <w:spacing w:before="100" w:beforeAutospacing="1" w:after="100" w:afterAutospacing="1" w:line="240" w:lineRule="auto"/>
+        <w:ind w:left="360"/>
+        <w:rPr>
+          <w:rFonts w:ascii="Arial" w:eastAsia="ＭＳ Ｐゴシック" w:hAnsi="Arial" w:cs="Arial"/>
+          <w:b/>
+          <w:bCs/>
+          <w:kern w:val="0"/>
+          <w:sz w:val="24"/>
+          <w14:ligatures w14:val="none"/>
+        </w:rPr>
+      </w:pPr>
+      <w:r>
+        <w:rPr>
+          <w:rFonts w:ascii="Arial" w:eastAsia="ＭＳ Ｐゴシック" w:hAnsi="Arial" w:cs="Arial"/>
+          <w:b/>
+          <w:bCs/>
+          <w:kern w:val="0"/>
+          <w:sz w:val="24"/>
+          <w14:ligatures w14:val="none"/>
+        </w:rPr>
+        <w:t>(c) Claims Handling and Transaction Correction System</w:t>
+      </w:r>
+    </w:p>
+    <w:p>
+      <w:pPr>
+        <w:widowControl/>
+        <w:spacing w:before="100" w:beforeAutospacing="1" w:after="100" w:afterAutospacing="1" w:line="240" w:lineRule="auto"/>
+        <w:ind w:left="360"/>
+        <w:rPr>
+          <w:rFonts w:ascii="Arial" w:eastAsia="ＭＳ Ｐゴシック" w:hAnsi="Arial" w:cs="Arial"/>
+          <w:b/>
+          <w:bCs/>
+          <w:kern w:val="0"/>
+          <w:sz w:val="24"/>
+          <w14:ligatures w14:val="none"/>
+        </w:rPr>
+      </w:pPr>
+      <w:r>
+        <w:rPr>
+          <w:rFonts w:ascii="Arial" w:eastAsia="ＭＳ Ｐゴシック" w:hAnsi="Arial" w:cs="Arial"/>
+          <w:b/>
+          <w:bCs/>
+          <w:kern w:val="0"/>
+          <w:sz w:val="24"/>
+          <w14:ligatures w14:val="none"/>
+        </w:rPr>
+        <w:t>(d) Dev-Ops Monitoring System</w:t>
+      </w:r>
+    </w:p>
+    <w:p>
+      <w:pPr>
+        <w:ind w:firstLine="360"/>
         <w:rPr>
           <w:rFonts w:ascii="Arial" w:hAnsi="Arial" w:cs="Arial"/>
+          <w:b/>
+          <w:bCs/>
+        </w:rPr>
+      </w:pPr>
+      <w:r>
+        <w:rPr>
+          <w:rFonts w:ascii="Arial" w:hAnsi="Arial" w:cs="Arial"/>
+          <w:b/>
+          <w:bCs/>
+        </w:rPr>
+        <w:t>(e) Overall Service Monitoring</w:t>
+      </w:r>
+    </w:p>
+    <w:p>
+      <w:pPr>
+        <w:rPr>
+          <w:rFonts w:ascii="Arial" w:hAnsi="Arial" w:cs="Arial" w:hint="eastAsia"/>
         </w:rPr>
       </w:pPr>
     </w:p>
@@ -2521,6 +3592,155 @@
     </w:lvl>
   </w:abstractNum>
   <w:abstractNum w:abstractNumId="2" w15:restartNumberingAfterBreak="0">
+    <w:nsid w:val="484C4D34"/>
+    <w:multiLevelType w:val="multilevel"/>
+    <w:tmpl w:val="1354DD6A"/>
+    <w:lvl w:ilvl="0">
+      <w:start w:val="1"/>
+      <w:numFmt w:val="bullet"/>
+      <w:lvlText w:val=""/>
+      <w:lvlJc w:val="left"/>
+      <w:pPr>
+        <w:tabs>
+          <w:tab w:val="num" w:pos="720"/>
+        </w:tabs>
+        <w:ind w:left="720" w:hanging="360"/>
+      </w:pPr>
+      <w:rPr>
+        <w:rFonts w:ascii="Symbol" w:hAnsi="Symbol" w:hint="default"/>
+        <w:sz w:val="20"/>
+      </w:rPr>
+    </w:lvl>
+    <w:lvl w:ilvl="1" w:tentative="1">
+      <w:start w:val="1"/>
+      <w:numFmt w:val="bullet"/>
+      <w:lvlText w:val="o"/>
+      <w:lvlJc w:val="left"/>
+      <w:pPr>
+        <w:tabs>
+          <w:tab w:val="num" w:pos="1440"/>
+        </w:tabs>
+        <w:ind w:left="1440" w:hanging="360"/>
+      </w:pPr>
+      <w:rPr>
+        <w:rFonts w:ascii="Courier New" w:hAnsi="Courier New" w:hint="default"/>
+        <w:sz w:val="20"/>
+      </w:rPr>
+    </w:lvl>
+    <w:lvl w:ilvl="2" w:tentative="1">
+      <w:start w:val="1"/>
+      <w:numFmt w:val="bullet"/>
+      <w:lvlText w:val=""/>
+      <w:lvlJc w:val="left"/>
+      <w:pPr>
+        <w:tabs>
+          <w:tab w:val="num" w:pos="2160"/>
+        </w:tabs>
+        <w:ind w:left="2160" w:hanging="360"/>
+      </w:pPr>
+      <w:rPr>
+        <w:rFonts w:ascii="Wingdings" w:hAnsi="Wingdings" w:hint="default"/>
+        <w:sz w:val="20"/>
+      </w:rPr>
+    </w:lvl>
+    <w:lvl w:ilvl="3" w:tentative="1">
+      <w:start w:val="1"/>
+      <w:numFmt w:val="bullet"/>
+      <w:lvlText w:val=""/>
+      <w:lvlJc w:val="left"/>
+      <w:pPr>
+        <w:tabs>
+          <w:tab w:val="num" w:pos="2880"/>
+        </w:tabs>
+        <w:ind w:left="2880" w:hanging="360"/>
+      </w:pPr>
+      <w:rPr>
+        <w:rFonts w:ascii="Wingdings" w:hAnsi="Wingdings" w:hint="default"/>
+        <w:sz w:val="20"/>
+      </w:rPr>
+    </w:lvl>
+    <w:lvl w:ilvl="4" w:tentative="1">
+      <w:start w:val="1"/>
+      <w:numFmt w:val="bullet"/>
+      <w:lvlText w:val=""/>
+      <w:lvlJc w:val="left"/>
+      <w:pPr>
+        <w:tabs>
+          <w:tab w:val="num" w:pos="3600"/>
+        </w:tabs>
+        <w:ind w:left="3600" w:hanging="360"/>
+      </w:pPr>
+      <w:rPr>
+        <w:rFonts w:ascii="Wingdings" w:hAnsi="Wingdings" w:hint="default"/>
+        <w:sz w:val="20"/>
+      </w:rPr>
+    </w:lvl>
+    <w:lvl w:ilvl="5" w:tentative="1">
+      <w:start w:val="1"/>
+      <w:numFmt w:val="bullet"/>
+      <w:lvlText w:val=""/>
+      <w:lvlJc w:val="left"/>
+      <w:pPr>
+        <w:tabs>
+          <w:tab w:val="num" w:pos="4320"/>
+        </w:tabs>
+        <w:ind w:left="4320" w:hanging="360"/>
+      </w:pPr>
+      <w:rPr>
+        <w:rFonts w:ascii="Wingdings" w:hAnsi="Wingdings" w:hint="default"/>
+        <w:sz w:val="20"/>
+      </w:rPr>
+    </w:lvl>
+    <w:lvl w:ilvl="6" w:tentative="1">
+      <w:start w:val="1"/>
+      <w:numFmt w:val="bullet"/>
+      <w:lvlText w:val=""/>
+      <w:lvlJc w:val="left"/>
+      <w:pPr>
+        <w:tabs>
+          <w:tab w:val="num" w:pos="5040"/>
+        </w:tabs>
+        <w:ind w:left="5040" w:hanging="360"/>
+      </w:pPr>
+      <w:rPr>
+        <w:rFonts w:ascii="Wingdings" w:hAnsi="Wingdings" w:hint="default"/>
+        <w:sz w:val="20"/>
+      </w:rPr>
+    </w:lvl>
+    <w:lvl w:ilvl="7" w:tentative="1">
+      <w:start w:val="1"/>
+      <w:numFmt w:val="bullet"/>
+      <w:lvlText w:val=""/>
+      <w:lvlJc w:val="left"/>
+      <w:pPr>
+        <w:tabs>
+          <w:tab w:val="num" w:pos="5760"/>
+        </w:tabs>
+        <w:ind w:left="5760" w:hanging="360"/>
+      </w:pPr>
+      <w:rPr>
+        <w:rFonts w:ascii="Wingdings" w:hAnsi="Wingdings" w:hint="default"/>
+        <w:sz w:val="20"/>
+      </w:rPr>
+    </w:lvl>
+    <w:lvl w:ilvl="8" w:tentative="1">
+      <w:start w:val="1"/>
+      <w:numFmt w:val="bullet"/>
+      <w:lvlText w:val=""/>
+      <w:lvlJc w:val="left"/>
+      <w:pPr>
+        <w:tabs>
+          <w:tab w:val="num" w:pos="6480"/>
+        </w:tabs>
+        <w:ind w:left="6480" w:hanging="360"/>
+      </w:pPr>
+      <w:rPr>
+        <w:rFonts w:ascii="Wingdings" w:hAnsi="Wingdings" w:hint="default"/>
+        <w:sz w:val="20"/>
+      </w:rPr>
+    </w:lvl>
+  </w:abstractNum>
+  <w:abstractNum w:abstractNumId="3" w15:restartNumberingAfterBreak="0">
     <w:nsid w:val="746929EF"/>
     <w:multiLevelType w:val="multilevel"/>
     <w:tmpl w:val="F2204D3C"/>
@@ -2637,10 +3857,13 @@
     <w:abstractNumId w:val="1"/>
   </w:num>
   <w:num w:numId="2" w16cid:durableId="942614340">
-    <w:abstractNumId w:val="2"/>
+    <w:abstractNumId w:val="3"/>
   </w:num>
   <w:num w:numId="3" w16cid:durableId="3483660">
     <w:abstractNumId w:val="0"/>
+  </w:num>
+  <w:num w:numId="4" w16cid:durableId="1679039881">
+    <w:abstractNumId w:val="2"/>
   </w:num>
 </w:numbering>
 </file>
@@ -3934,7 +5157,7 @@
 </file>
 
 <file path=customXml/itemProps1.xml><?xml version="1.0" encoding="utf-8"?>
-<ds:datastoreItem xmlns:ds="http://schemas.openxmlformats.org/officeDocument/2006/customXml" ds:itemID="{0F387ADC-869C-D243-9847-EC23CFB098C2}">
+<ds:datastoreItem xmlns:ds="http://schemas.openxmlformats.org/officeDocument/2006/customXml" ds:itemID="{A4AC6444-E249-5F4C-83E1-ACD4B72DC9BB}">
   <ds:schemaRefs>
     <ds:schemaRef ds:uri="http://schemas.openxmlformats.org/officeDocument/2006/bibliography"/>
   </ds:schemaRefs>

</xml_diff>